<commit_message>
Fix:Permission Issue in Download
</commit_message>
<xml_diff>
--- a/outputs/reports/eCRF_Specification_VS.docx
+++ b/outputs/reports/eCRF_Specification_VS.docx
@@ -167,6 +167,28 @@
           </w:tcPr>
           <w:p>
             <w:r>
+              <w:t>Brief Summary</w:t>
+            </w:r>
+          </w:p>
+        </w:tc>
+        <w:tc>
+          <w:tcPr>
+            <w:tcW w:type="dxa" w:w="4320"/>
+          </w:tcPr>
+          <w:p>
+            <w:r>
+              <w:t>This is a double-blind, sham-controlled clinical study to evaluate the safety and feasibility of AMI MultiStem therapy in subjects who have had a heart attack (Non-ST elevation MI).</w:t>
+            </w:r>
+          </w:p>
+        </w:tc>
+      </w:tr>
+      <w:tr>
+        <w:tc>
+          <w:tcPr>
+            <w:tcW w:type="dxa" w:w="4320"/>
+          </w:tcPr>
+          <w:p>
+            <w:r>
               <w:t>Study Type</w:t>
             </w:r>
           </w:p>
@@ -233,6 +255,28 @@
           </w:tcPr>
           <w:p>
             <w:r>
+              <w:t>Primary Purpose</w:t>
+            </w:r>
+          </w:p>
+        </w:tc>
+        <w:tc>
+          <w:tcPr>
+            <w:tcW w:type="dxa" w:w="4320"/>
+          </w:tcPr>
+          <w:p>
+            <w:r>
+              <w:t>TREATMENT</w:t>
+            </w:r>
+          </w:p>
+        </w:tc>
+      </w:tr>
+      <w:tr>
+        <w:tc>
+          <w:tcPr>
+            <w:tcW w:type="dxa" w:w="4320"/>
+          </w:tcPr>
+          <w:p>
+            <w:r>
               <w:t>Masking</w:t>
             </w:r>
           </w:p>
@@ -255,7 +299,7 @@
           </w:tcPr>
           <w:p>
             <w:r>
-              <w:t>Masking Who</w:t>
+              <w:t>Who Masked</w:t>
             </w:r>
           </w:p>
         </w:tc>
@@ -309,7 +353,7 @@
           </w:tcPr>
           <w:p>
             <w:r>
-              <w:t>[{'label': 'AMI MultiStem cells', 'type': 'EXPERIMENTAL', 'description': 'AMI MultiStem cells is a cell therapy medicinal product originating from adherent stem cells taken from the bone marrow of a non-related donor and expanded ex vivo.'}, {'label': 'Sham', 'type': 'SHAM_COMPARATOR', 'description': 'Sham procedure using Micro-Infusion Catheter in coronary artery without injection.'}]</w:t>
+              <w:t>[{'label': 'AMI MultiStem cells', 'type': 'EXPERIMENTAL', 'description': 'AMI MultiStem cells is a cell therapy medicinal product originating from adherent stem cells taken from the bone marrow of a non-related donor and expanded ex vivo.', 'intervention_names': ['Biological: AMI MultiStem cells']}, {'label': 'Sham', 'type': 'SHAM_COMPARATOR', 'description': 'Sham procedure using Micro-Infusion Catheter in coronary artery without injection.', 'intervention_names': []}]</w:t>
             </w:r>
           </w:p>
         </w:tc>
@@ -1433,263 +1477,7 @@
           </w:tcPr>
           <w:p>
             <w:r>
-              <w:t>N=No, Y=Yes</w:t>
-            </w:r>
-          </w:p>
-        </w:tc>
-      </w:tr>
-      <w:tr>
-        <w:tc>
-          <w:tcPr>
-            <w:tcW w:type="dxa" w:w="1728"/>
-          </w:tcPr>
-          <w:p>
-            <w:r>
-              <w:t>VS_HORIZONTAL_VSDAT</w:t>
-            </w:r>
-          </w:p>
-        </w:tc>
-        <w:tc>
-          <w:tcPr>
-            <w:tcW w:type="dxa" w:w="1728"/>
-          </w:tcPr>
-          <w:p>
-            <w:r>
-              <w:t>Date</w:t>
-            </w:r>
-          </w:p>
-        </w:tc>
-        <w:tc>
-          <w:tcPr>
-            <w:tcW w:type="dxa" w:w="1728"/>
-          </w:tcPr>
-          <w:p>
-            <w:r>
-              <w:t>Char</w:t>
-            </w:r>
-          </w:p>
-        </w:tc>
-        <w:tc>
-          <w:tcPr>
-            <w:tcW w:type="dxa" w:w="1728"/>
-          </w:tcPr>
-          <w:p>
-            <w:r>
-              <w:t>text</w:t>
-            </w:r>
-          </w:p>
-        </w:tc>
-        <w:tc>
-          <w:tcPr>
-            <w:tcW w:type="dxa" w:w="1728"/>
-          </w:tcPr>
-          <w:p/>
-        </w:tc>
-      </w:tr>
-      <w:tr>
-        <w:tc>
-          <w:tcPr>
-            <w:tcW w:type="dxa" w:w="1728"/>
-          </w:tcPr>
-          <w:p>
-            <w:r>
-              <w:t>VS_HORIZONTAL_BP_VSPOS</w:t>
-            </w:r>
-          </w:p>
-        </w:tc>
-        <w:tc>
-          <w:tcPr>
-            <w:tcW w:type="dxa" w:w="1728"/>
-          </w:tcPr>
-          <w:p>
-            <w:r>
-              <w:t>Blood Pressure Position</w:t>
-            </w:r>
-          </w:p>
-        </w:tc>
-        <w:tc>
-          <w:tcPr>
-            <w:tcW w:type="dxa" w:w="1728"/>
-          </w:tcPr>
-          <w:p>
-            <w:r>
-              <w:t>Char</w:t>
-            </w:r>
-          </w:p>
-        </w:tc>
-        <w:tc>
-          <w:tcPr>
-            <w:tcW w:type="dxa" w:w="1728"/>
-          </w:tcPr>
-          <w:p>
-            <w:r>
-              <w:t>text</w:t>
-            </w:r>
-          </w:p>
-        </w:tc>
-        <w:tc>
-          <w:tcPr>
-            <w:tcW w:type="dxa" w:w="1728"/>
-          </w:tcPr>
-          <w:p>
-            <w:r>
-              <w:t>PRONE=Prone, SEMI-RECUMBENT=Semi-Recumbent, SITTING=Sitting, STANDING=Standing, SUPINE=Supine</w:t>
-            </w:r>
-          </w:p>
-        </w:tc>
-      </w:tr>
-      <w:tr>
-        <w:tc>
-          <w:tcPr>
-            <w:tcW w:type="dxa" w:w="1728"/>
-          </w:tcPr>
-          <w:p>
-            <w:r>
-              <w:t>VS_HORIZONTAL_BP_VSLOC</w:t>
-            </w:r>
-          </w:p>
-        </w:tc>
-        <w:tc>
-          <w:tcPr>
-            <w:tcW w:type="dxa" w:w="1728"/>
-          </w:tcPr>
-          <w:p>
-            <w:r>
-              <w:t>Blood Pressure Location</w:t>
-            </w:r>
-          </w:p>
-        </w:tc>
-        <w:tc>
-          <w:tcPr>
-            <w:tcW w:type="dxa" w:w="1728"/>
-          </w:tcPr>
-          <w:p>
-            <w:r>
-              <w:t>Char</w:t>
-            </w:r>
-          </w:p>
-        </w:tc>
-        <w:tc>
-          <w:tcPr>
-            <w:tcW w:type="dxa" w:w="1728"/>
-          </w:tcPr>
-          <w:p>
-            <w:r>
-              <w:t>text</w:t>
-            </w:r>
-          </w:p>
-        </w:tc>
-        <w:tc>
-          <w:tcPr>
-            <w:tcW w:type="dxa" w:w="1728"/>
-          </w:tcPr>
-          <w:p>
-            <w:r>
-              <w:t>BRACHIAL ARTERY=Brachial Artery, FINGER=Finger, PERIPHERAL ARTERY=Peripheral Artery, RADIAL ARTERY=Radial Artery</w:t>
-            </w:r>
-          </w:p>
-        </w:tc>
-      </w:tr>
-      <w:tr>
-        <w:tc>
-          <w:tcPr>
-            <w:tcW w:type="dxa" w:w="1728"/>
-          </w:tcPr>
-          <w:p>
-            <w:r>
-              <w:t>VS_HORIZONTAL_PULSE_VSLOC</w:t>
-            </w:r>
-          </w:p>
-        </w:tc>
-        <w:tc>
-          <w:tcPr>
-            <w:tcW w:type="dxa" w:w="1728"/>
-          </w:tcPr>
-          <w:p>
-            <w:r>
-              <w:t>Pulse Location</w:t>
-            </w:r>
-          </w:p>
-        </w:tc>
-        <w:tc>
-          <w:tcPr>
-            <w:tcW w:type="dxa" w:w="1728"/>
-          </w:tcPr>
-          <w:p>
-            <w:r>
-              <w:t>Char</w:t>
-            </w:r>
-          </w:p>
-        </w:tc>
-        <w:tc>
-          <w:tcPr>
-            <w:tcW w:type="dxa" w:w="1728"/>
-          </w:tcPr>
-          <w:p>
-            <w:r>
-              <w:t>text</w:t>
-            </w:r>
-          </w:p>
-        </w:tc>
-        <w:tc>
-          <w:tcPr>
-            <w:tcW w:type="dxa" w:w="1728"/>
-          </w:tcPr>
-          <w:p>
-            <w:r>
-              <w:t>BRACHIAL ARTERY=Brachial Artery, CAROTID ARTERY=Carotid Artery, CEREBRAL ARTERY=Cerebral Artery, DORSALIS PEDIS ARTERY=Dorsalis Pedis Artery, FEMORAL ARTERY=Femoral Artery, PERIPHERAL ARTERY=Peripheral Artery</w:t>
-            </w:r>
-          </w:p>
-        </w:tc>
-      </w:tr>
-      <w:tr>
-        <w:tc>
-          <w:tcPr>
-            <w:tcW w:type="dxa" w:w="1728"/>
-          </w:tcPr>
-          <w:p>
-            <w:r>
-              <w:t>VS_HORIZONTAL_TEMP_VSLOC</w:t>
-            </w:r>
-          </w:p>
-        </w:tc>
-        <w:tc>
-          <w:tcPr>
-            <w:tcW w:type="dxa" w:w="1728"/>
-          </w:tcPr>
-          <w:p>
-            <w:r>
-              <w:t>Temperature Location</w:t>
-            </w:r>
-          </w:p>
-        </w:tc>
-        <w:tc>
-          <w:tcPr>
-            <w:tcW w:type="dxa" w:w="1728"/>
-          </w:tcPr>
-          <w:p>
-            <w:r>
-              <w:t>Char</w:t>
-            </w:r>
-          </w:p>
-        </w:tc>
-        <w:tc>
-          <w:tcPr>
-            <w:tcW w:type="dxa" w:w="1728"/>
-          </w:tcPr>
-          <w:p>
-            <w:r>
-              <w:t>text</w:t>
-            </w:r>
-          </w:p>
-        </w:tc>
-        <w:tc>
-          <w:tcPr>
-            <w:tcW w:type="dxa" w:w="1728"/>
-          </w:tcPr>
-          <w:p>
-            <w:r>
-              <w:t>AXILLA=Axilla, EAR=Ear, FOREHEAD=Forehead, ORAL CAVITY=Oral Cavity</w:t>
+              <w:t>N=No, Y</w:t>
             </w:r>
           </w:p>
         </w:tc>

</xml_diff>